<commit_message>
Agrega CRUD de clientes y actualiza el manual
</commit_message>
<xml_diff>
--- a/Documentos/Manual_Tecnico_LavaFacil.docx
+++ b/Documentos/Manual_Tecnico_LavaFacil.docx
@@ -12,7 +12,7 @@
           <w:noProof/>
         </w:rPr>
         <w:drawing>
-          <wp:inline distT="0" distB="0" distL="0" distR="0" wp14:anchorId="1D495AE6" wp14:editId="2230EBB8">
+          <wp:inline distT="0" distB="0" distL="0" distR="0" wp14:anchorId="47D65A3B" wp14:editId="05505531">
             <wp:extent cx="868680" cy="868680"/>
             <wp:effectExtent l="0" t="0" r="0" b="0"/>
             <wp:docPr id="17" name="Picture 17"/>
@@ -1382,12 +1382,6 @@
                 <w:sz w:val="20"/>
               </w:rPr>
               <w:br/>
-            </w:r>
-            <w:r>
-              <w:rPr>
-                <w:color w:val="172A31"/>
-                <w:sz w:val="20"/>
-              </w:rPr>
               <w:t>Aplicativo local 127.0.0.1:5088</w:t>
             </w:r>
           </w:p>
@@ -1847,7 +1841,7 @@
           <w:noProof/>
         </w:rPr>
         <w:drawing>
-          <wp:inline distT="0" distB="0" distL="0" distR="0" wp14:anchorId="49CFB43B" wp14:editId="404212BA">
+          <wp:inline distT="0" distB="0" distL="0" distR="0" wp14:anchorId="75E0DE69" wp14:editId="4EC16964">
             <wp:extent cx="6400800" cy="2888076"/>
             <wp:effectExtent l="0" t="0" r="0" b="0"/>
             <wp:docPr id="1" name="Picture 1"/>
@@ -2809,7 +2803,7 @@
           <w:noProof/>
         </w:rPr>
         <w:drawing>
-          <wp:inline distT="0" distB="0" distL="0" distR="0" wp14:anchorId="41D53480" wp14:editId="2B4BDE8E">
+          <wp:inline distT="0" distB="0" distL="0" distR="0" wp14:anchorId="6CF4F5EB" wp14:editId="0C8B3B59">
             <wp:extent cx="6400800" cy="3801122"/>
             <wp:effectExtent l="0" t="0" r="0" b="0"/>
             <wp:docPr id="2" name="Picture 2"/>
@@ -3195,7 +3189,7 @@
           <w:noProof/>
         </w:rPr>
         <w:drawing>
-          <wp:inline distT="0" distB="0" distL="0" distR="0" wp14:anchorId="18A5AF13" wp14:editId="273A3C4D">
+          <wp:inline distT="0" distB="0" distL="0" distR="0" wp14:anchorId="54708C4A" wp14:editId="7CC2CD3E">
             <wp:extent cx="5570530" cy="3428999"/>
             <wp:effectExtent l="0" t="0" r="0" b="0"/>
             <wp:docPr id="3" name="Picture 3"/>
@@ -3325,7 +3319,7 @@
           <w:noProof/>
         </w:rPr>
         <w:drawing>
-          <wp:inline distT="0" distB="0" distL="0" distR="0" wp14:anchorId="00282BFF" wp14:editId="202C76D5">
+          <wp:inline distT="0" distB="0" distL="0" distR="0" wp14:anchorId="5848C5F9" wp14:editId="7ADFC46F">
             <wp:extent cx="6400800" cy="2905032"/>
             <wp:effectExtent l="0" t="0" r="0" b="0"/>
             <wp:docPr id="4" name="Picture 4"/>
@@ -3514,7 +3508,7 @@
           <w:noProof/>
         </w:rPr>
         <w:drawing>
-          <wp:inline distT="0" distB="0" distL="0" distR="0" wp14:anchorId="64D78EC3" wp14:editId="3C8CBEB5">
+          <wp:inline distT="0" distB="0" distL="0" distR="0" wp14:anchorId="757FD480" wp14:editId="44082E35">
             <wp:extent cx="2916052" cy="3886200"/>
             <wp:effectExtent l="0" t="0" r="0" b="0"/>
             <wp:docPr id="5" name="Picture 5"/>
@@ -3746,7 +3740,7 @@
           <w:noProof/>
         </w:rPr>
         <w:drawing>
-          <wp:inline distT="0" distB="0" distL="0" distR="0" wp14:anchorId="7E7D06DC" wp14:editId="1D7D0F59">
+          <wp:inline distT="0" distB="0" distL="0" distR="0" wp14:anchorId="08E17CE7" wp14:editId="4D814EA2">
             <wp:extent cx="5787361" cy="3886200"/>
             <wp:effectExtent l="0" t="0" r="0" b="0"/>
             <wp:docPr id="6" name="Picture 6"/>
@@ -3906,7 +3900,7 @@
           <w:noProof/>
         </w:rPr>
         <w:drawing>
-          <wp:inline distT="0" distB="0" distL="0" distR="0" wp14:anchorId="61C292AF" wp14:editId="00823D1D">
+          <wp:inline distT="0" distB="0" distL="0" distR="0" wp14:anchorId="74B276D6" wp14:editId="7D85F5B6">
             <wp:extent cx="6400800" cy="1138422"/>
             <wp:effectExtent l="0" t="0" r="0" b="0"/>
             <wp:docPr id="7" name="Picture 7"/>
@@ -4158,7 +4152,7 @@
           <w:noProof/>
         </w:rPr>
         <w:drawing>
-          <wp:inline distT="0" distB="0" distL="0" distR="0" wp14:anchorId="1F6F267A" wp14:editId="0623DEDB">
+          <wp:inline distT="0" distB="0" distL="0" distR="0" wp14:anchorId="17303EA1" wp14:editId="30DF758A">
             <wp:extent cx="4982670" cy="2423160"/>
             <wp:effectExtent l="0" t="0" r="0" b="0"/>
             <wp:docPr id="8" name="Picture 8"/>
@@ -4217,7 +4211,7 @@
           <w:noProof/>
         </w:rPr>
         <w:drawing>
-          <wp:inline distT="0" distB="0" distL="0" distR="0" wp14:anchorId="29292FF2" wp14:editId="2C211179">
+          <wp:inline distT="0" distB="0" distL="0" distR="0" wp14:anchorId="07ACFAD0" wp14:editId="121EC293">
             <wp:extent cx="3608046" cy="3154680"/>
             <wp:effectExtent l="0" t="0" r="0" b="0"/>
             <wp:docPr id="9" name="Picture 9"/>
@@ -4292,7 +4286,7 @@
           <w:noProof/>
         </w:rPr>
         <w:drawing>
-          <wp:inline distT="0" distB="0" distL="0" distR="0" wp14:anchorId="0BA813C8" wp14:editId="4A0BA00F">
+          <wp:inline distT="0" distB="0" distL="0" distR="0" wp14:anchorId="411B400B" wp14:editId="4D74BA24">
             <wp:extent cx="3608046" cy="3154680"/>
             <wp:effectExtent l="0" t="0" r="0" b="0"/>
             <wp:docPr id="10" name="Picture 10"/>
@@ -4356,7 +4350,7 @@
           <w:noProof/>
         </w:rPr>
         <w:drawing>
-          <wp:inline distT="0" distB="0" distL="0" distR="0" wp14:anchorId="3B082AB7" wp14:editId="435B86BF">
+          <wp:inline distT="0" distB="0" distL="0" distR="0" wp14:anchorId="1215D03F" wp14:editId="69E2BA34">
             <wp:extent cx="3332910" cy="3154680"/>
             <wp:effectExtent l="0" t="0" r="0" b="0"/>
             <wp:docPr id="11" name="Picture 11"/>
@@ -4431,7 +4425,7 @@
           <w:noProof/>
         </w:rPr>
         <w:drawing>
-          <wp:inline distT="0" distB="0" distL="0" distR="0" wp14:anchorId="294D262E" wp14:editId="0FBE6F8E">
+          <wp:inline distT="0" distB="0" distL="0" distR="0" wp14:anchorId="3A0E5B5F" wp14:editId="53D4165D">
             <wp:extent cx="2349225" cy="2788920"/>
             <wp:effectExtent l="0" t="0" r="0" b="0"/>
             <wp:docPr id="12" name="Picture 12"/>
@@ -4495,7 +4489,7 @@
           <w:noProof/>
         </w:rPr>
         <w:drawing>
-          <wp:inline distT="0" distB="0" distL="0" distR="0" wp14:anchorId="17CA60F2" wp14:editId="49F5ECE5">
+          <wp:inline distT="0" distB="0" distL="0" distR="0" wp14:anchorId="0A6AD93C" wp14:editId="401C9868">
             <wp:extent cx="3189722" cy="2788920"/>
             <wp:effectExtent l="0" t="0" r="0" b="0"/>
             <wp:docPr id="13" name="Picture 13"/>
@@ -4580,7 +4574,7 @@
           <w:noProof/>
         </w:rPr>
         <w:drawing>
-          <wp:inline distT="0" distB="0" distL="0" distR="0" wp14:anchorId="7A8DE3E1" wp14:editId="306C3503">
+          <wp:inline distT="0" distB="0" distL="0" distR="0" wp14:anchorId="240F9DCF" wp14:editId="0625C161">
             <wp:extent cx="2952393" cy="2743200"/>
             <wp:effectExtent l="0" t="0" r="0" b="0"/>
             <wp:docPr id="14" name="Picture 14"/>
@@ -4630,8 +4624,7 @@
     </w:p>
     <w:p>
       <w:pPr>
-        <w:keepNext/>
-        <w:spacing w:before="160" w:after="0"/>
+        <w:spacing w:before="120" w:after="100"/>
         <w:jc w:val="center"/>
       </w:pPr>
       <w:r>
@@ -4639,10 +4632,10 @@
           <w:noProof/>
         </w:rPr>
         <w:drawing>
-          <wp:inline distT="0" distB="0" distL="0" distR="0" wp14:anchorId="423A7ABF" wp14:editId="5883D63D">
-            <wp:extent cx="2969484" cy="2743200"/>
+          <wp:inline distT="0" distB="0" distL="0" distR="0" wp14:anchorId="71785C09" wp14:editId="316FAF25">
+            <wp:extent cx="6172200" cy="4809824"/>
             <wp:effectExtent l="0" t="0" r="0" b="0"/>
-            <wp:docPr id="15" name="Picture 15"/>
+            <wp:docPr id="18" name="Picture 18"/>
             <wp:cNvGraphicFramePr>
               <a:graphicFrameLocks xmlns:a="http://schemas.openxmlformats.org/drawingml/2006/main" noChangeAspect="1"/>
             </wp:cNvGraphicFramePr>
@@ -4650,7 +4643,7 @@
               <a:graphicData uri="http://schemas.openxmlformats.org/drawingml/2006/picture">
                 <pic:pic xmlns:pic="http://schemas.openxmlformats.org/drawingml/2006/picture">
                   <pic:nvPicPr>
-                    <pic:cNvPr id="0" name="04-Clientes-Datos-Finales.jpg"/>
+                    <pic:cNvPr id="0" name="01-CRUD-Clientes.jpg"/>
                     <pic:cNvPicPr/>
                   </pic:nvPicPr>
                   <pic:blipFill>
@@ -4662,7 +4655,7 @@
                   <pic:spPr>
                     <a:xfrm>
                       <a:off x="0" y="0"/>
-                      <a:ext cx="2969484" cy="2743200"/>
+                      <a:ext cx="6172200" cy="4809824"/>
                     </a:xfrm>
                     <a:prstGeom prst="rect">
                       <a:avLst/>
@@ -4676,15 +4669,8 @@
       </w:r>
     </w:p>
     <w:p>
-      <w:pPr>
-        <w:pStyle w:val="Descripcin"/>
-        <w:spacing w:before="80" w:after="280" w:line="252" w:lineRule="auto"/>
-      </w:pPr>
-      <w:r>
-        <w:rPr>
-          <w:color w:val="46545A"/>
-        </w:rPr>
-        <w:t>Figura 15 · Tres clientes ficticios de la entrega final. No son el cliente temporal eliminado de la conmutación.</w:t>
+      <w:r>
+        <w:t>Figura 15 — CRUD de clientes con datos ficticios: búsqueda, edición, activación, desactivación y eliminación protegida.</w:t>
       </w:r>
     </w:p>
     <w:p>
@@ -4724,7 +4710,7 @@
           <w:noProof/>
         </w:rPr>
         <w:drawing>
-          <wp:inline distT="0" distB="0" distL="0" distR="0" wp14:anchorId="54BECEBB" wp14:editId="370DBD57">
+          <wp:inline distT="0" distB="0" distL="0" distR="0" wp14:anchorId="249EEB3F" wp14:editId="7FB38A54">
             <wp:extent cx="4485886" cy="3886200"/>
             <wp:effectExtent l="0" t="0" r="0" b="0"/>
             <wp:docPr id="16" name="Picture 16"/>
@@ -6195,6 +6181,60 @@
         <w:t>El panel administrativo revisa las dos instancias cada 15 segundos. Muestra disponibilidad, rol conocido, sincronización, servidor activo y hora de la consulta. Los perfiles de cliente y empleado reciben un aviso general de disponibilidad sin exponer la topología.</w:t>
       </w:r>
     </w:p>
+    <w:p>
+      <w:pPr>
+        <w:jc w:val="center"/>
+      </w:pPr>
+      <w:r>
+        <w:rPr>
+          <w:noProof/>
+        </w:rPr>
+        <w:drawing>
+          <wp:inline distT="0" distB="0" distL="0" distR="0" wp14:anchorId="25CEAC6E" wp14:editId="04B9D1CE">
+            <wp:extent cx="6172200" cy="6806999"/>
+            <wp:effectExtent l="0" t="0" r="0" b="0"/>
+            <wp:docPr id="19" name="Picture 19"/>
+            <wp:cNvGraphicFramePr>
+              <a:graphicFrameLocks xmlns:a="http://schemas.openxmlformats.org/drawingml/2006/main" noChangeAspect="1"/>
+            </wp:cNvGraphicFramePr>
+            <a:graphic xmlns:a="http://schemas.openxmlformats.org/drawingml/2006/main">
+              <a:graphicData uri="http://schemas.openxmlformats.org/drawingml/2006/picture">
+                <pic:pic xmlns:pic="http://schemas.openxmlformats.org/drawingml/2006/picture">
+                  <pic:nvPicPr>
+                    <pic:cNvPr id="0" name="02-Fallo-Mirroring.jpg"/>
+                    <pic:cNvPicPr/>
+                  </pic:nvPicPr>
+                  <pic:blipFill>
+                    <a:blip r:embed="rId25"/>
+                    <a:stretch>
+                      <a:fillRect/>
+                    </a:stretch>
+                  </pic:blipFill>
+                  <pic:spPr>
+                    <a:xfrm>
+                      <a:off x="0" y="0"/>
+                      <a:ext cx="6172200" cy="6806999"/>
+                    </a:xfrm>
+                    <a:prstGeom prst="rect">
+                      <a:avLst/>
+                    </a:prstGeom>
+                  </pic:spPr>
+                </pic:pic>
+              </a:graphicData>
+            </a:graphic>
+          </wp:inline>
+        </w:drawing>
+      </w:r>
+    </w:p>
+    <w:p>
+      <w:pPr>
+        <w:pStyle w:val="Descripcin"/>
+        <w:jc w:val="center"/>
+      </w:pPr>
+      <w:r>
+        <w:t>Figura 17 — Diagnóstico real durante una interrupción: MADRENZO continúa disponible como PRINCIPAL, Mirroring informa DISCONNECTED y el servidor espejo no confirma conexión.</w:t>
+      </w:r>
+    </w:p>
     <w:tbl>
       <w:tblPr>
         <w:tblW w:w="0" w:type="auto"/>
@@ -7108,15 +7148,15 @@
       </w:r>
     </w:p>
     <w:p>
-      <w:pPr>
-        <w:spacing w:after="180"/>
-      </w:pPr>
-      <w:r>
-        <w:rPr>
-          <w:sz w:val="18"/>
-        </w:rPr>
-        <w:t>https://learn.microsoft.com/en-us/sql/database-engine/database-mirroring/prepare-a-mirror-database-for-mirroring-sql-server?view=sql-server-ver16</w:t>
-      </w:r>
+      <w:hyperlink r:id="rId26">
+        <w:r>
+          <w:rPr>
+            <w:color w:val="0563C1"/>
+            <w:u w:val="single"/>
+          </w:rPr>
+          <w:t>https://learn.microsoft.com/en-us/sql/database-engine/database-mirroring/prepare-a-mirror-database-for-mirroring-sql-server?view=sql-server-ver16</w:t>
+        </w:r>
+      </w:hyperlink>
     </w:p>
     <w:p>
       <w:r>
@@ -7124,15 +7164,15 @@
       </w:r>
     </w:p>
     <w:p>
-      <w:pPr>
-        <w:spacing w:after="180"/>
-      </w:pPr>
-      <w:r>
-        <w:rPr>
-          <w:sz w:val="18"/>
-        </w:rPr>
-        <w:t>https://learn.microsoft.com/en-us/sql/database-engine/database-mirroring/database-mirroring-use-certificates-for-inbound-connections?view=sql-server-ver17</w:t>
-      </w:r>
+      <w:hyperlink r:id="rId27">
+        <w:r>
+          <w:rPr>
+            <w:color w:val="0563C1"/>
+            <w:u w:val="single"/>
+          </w:rPr>
+          <w:t>https://learn.microsoft.com/en-us/sql/database-engine/database-mirroring/database-mirroring-use-certificates-for-inbound-connections?view=sql-server-ver17</w:t>
+        </w:r>
+      </w:hyperlink>
     </w:p>
     <w:p>
       <w:r>
@@ -7140,15 +7180,15 @@
       </w:r>
     </w:p>
     <w:p>
-      <w:pPr>
-        <w:spacing w:after="180"/>
-      </w:pPr>
-      <w:r>
-        <w:rPr>
-          <w:sz w:val="18"/>
-        </w:rPr>
-        <w:t>https://learn.microsoft.com/en-us/sql/database-engine/database-mirroring/connect-clients-to-a-database-mirroring-session-sql-server?view=sql-server-ver17</w:t>
-      </w:r>
+      <w:hyperlink r:id="rId28">
+        <w:r>
+          <w:rPr>
+            <w:color w:val="0563C1"/>
+            <w:u w:val="single"/>
+          </w:rPr>
+          <w:t>https://learn.microsoft.com/en-us/sql/database-engine/database-mirroring/connect-clients-to-a-database-mirroring-session-sql-server?view=sql-server-ver17</w:t>
+        </w:r>
+      </w:hyperlink>
     </w:p>
     <w:p>
       <w:r>
@@ -7156,15 +7196,15 @@
       </w:r>
     </w:p>
     <w:p>
-      <w:pPr>
-        <w:spacing w:after="180"/>
-      </w:pPr>
-      <w:r>
-        <w:rPr>
-          <w:sz w:val="18"/>
-        </w:rPr>
-        <w:t>https://learn.microsoft.com/en-us/sql/database-engine/database-mirroring/database-mirroring-witness?view=sql-server-ver16</w:t>
-      </w:r>
+      <w:hyperlink r:id="rId29">
+        <w:r>
+          <w:rPr>
+            <w:color w:val="0563C1"/>
+            <w:u w:val="single"/>
+          </w:rPr>
+          <w:t>https://learn.microsoft.com/en-us/sql/database-engine/database-mirroring/database-mirroring-witness?view=sql-server-ver16</w:t>
+        </w:r>
+      </w:hyperlink>
     </w:p>
     <w:p>
       <w:r>
@@ -7172,15 +7212,15 @@
       </w:r>
     </w:p>
     <w:p>
-      <w:pPr>
-        <w:spacing w:after="180"/>
-      </w:pPr>
-      <w:r>
-        <w:rPr>
-          <w:sz w:val="18"/>
-        </w:rPr>
-        <w:t>https://learn.microsoft.com/sql/ssms/scripting/generate-and-publish-scripts-wizard</w:t>
-      </w:r>
+      <w:hyperlink r:id="rId30">
+        <w:r>
+          <w:rPr>
+            <w:color w:val="0563C1"/>
+            <w:u w:val="single"/>
+          </w:rPr>
+          <w:t>https://learn.microsoft.com/en-us/ssms/scripting/generate-and-publish-scripts-wizard</w:t>
+        </w:r>
+      </w:hyperlink>
     </w:p>
     <w:p>
       <w:r>
@@ -7188,19 +7228,19 @@
       </w:r>
     </w:p>
     <w:p>
-      <w:pPr>
-        <w:spacing w:after="180"/>
-      </w:pPr>
-      <w:r>
-        <w:rPr>
-          <w:sz w:val="18"/>
-        </w:rPr>
-        <w:t>https://tailscale.com/docs/install/windows</w:t>
-      </w:r>
-    </w:p>
-    <w:p>
-      <w:r>
-        <w:t>Consulta de documentación: 11 de octubre de 2026. Las instrucciones de referencia deben adaptarse a los nombres, permisos y rutas del equipo antes de ejecutarse.</w:t>
+      <w:hyperlink r:id="rId31">
+        <w:r>
+          <w:rPr>
+            <w:color w:val="0563C1"/>
+            <w:u w:val="single"/>
+          </w:rPr>
+          <w:t>https://tailscale.com/docs/install/windows</w:t>
+        </w:r>
+      </w:hyperlink>
+    </w:p>
+    <w:p>
+      <w:r>
+        <w:t>Enlaces comprobados el 19 de octubre de 2026. Las instrucciones de referencia deben adaptarse a los nombres, permisos y rutas del equipo antes de ejecutarse.</w:t>
       </w:r>
     </w:p>
     <w:p>
@@ -7392,15 +7432,7 @@
           <w:sz w:val="19"/>
         </w:rPr>
         <w:br/>
-        <w:t>TO FILE = 'C:\Mirroring\Cer</w:t>
-      </w:r>
-      <w:r>
-        <w:rPr>
-          <w:rFonts w:ascii="Consolas" w:hAnsi="Consolas"/>
-          <w:color w:val="244753"/>
-          <w:sz w:val="19"/>
-        </w:rPr>
-        <w:t>tificado_MADRENZO.cer';</w:t>
+        <w:t>TO FILE = 'C:\Mirroring\Certificado_MADRENZO.cer';</w:t>
       </w:r>
       <w:r>
         <w:rPr>
@@ -7750,7 +7782,7 @@
       </w:r>
     </w:p>
     <w:p>
-      <w:hyperlink r:id="rId25">
+      <w:hyperlink r:id="rId32">
         <w:r>
           <w:rPr>
             <w:color w:val="0563C1"/>
@@ -7804,9 +7836,15 @@
         <w:t>El video aparece en YouTube como Oculto. Mantenerlo disponible mediante el enlace para la revisión del proyecto y evitar cambiarlo a Privado o eliminarlo antes de la evaluación. Probar el enlace en una ventana sin sesión para confirmar que el docente pueda verlo.</w:t>
       </w:r>
     </w:p>
+    <w:p>
+      <w:pPr>
+        <w:spacing w:before="120" w:after="100"/>
+      </w:pPr>
+    </w:p>
+    <w:p/>
     <w:sectPr>
-      <w:headerReference w:type="default" r:id="rId26"/>
-      <w:footerReference w:type="default" r:id="rId27"/>
+      <w:headerReference w:type="default" r:id="rId33"/>
+      <w:footerReference w:type="default" r:id="rId34"/>
       <w:pgSz w:w="12240" w:h="15840"/>
       <w:pgMar w:top="936" w:right="1080" w:bottom="936" w:left="1080" w:header="432" w:footer="432" w:gutter="0"/>
       <w:cols w:space="720"/>

</xml_diff>